<commit_message>
Regenerate resumes/cover letters (2026-10-31_072107)
</commit_message>
<xml_diff>
--- a/generated/Dennis Dole Resume.docx
+++ b/generated/Dennis Dole Resume.docx
@@ -399,9 +399,9 @@
         <w:tblLook w:firstColumn="1" w:firstRow="1" w:lastColumn="0" w:lastRow="0" w:noHBand="0" w:noVBand="1" w:val="04A0"/>
       </w:tblPr>
       <w:tblGrid>
-        <w:gridCol w:w="4089"/>
+        <w:gridCol w:w="4339"/>
         <w:gridCol w:w="3991"/>
-        <w:gridCol w:w="2001"/>
+        <w:gridCol w:w="1751"/>
       </w:tblGrid>
       <w:tr>
         <w:tc>
@@ -449,7 +449,7 @@
               <w:rPr>
                 <w:b/>
               </w:rPr>
-              <w:t>Aug 2025 to Present</w:t>
+              <w:t>2025-08 to Present</w:t>
             </w:r>
           </w:p>
         </w:tc>
@@ -529,9 +529,9 @@
         <w:tblLook w:firstColumn="1" w:firstRow="1" w:lastColumn="0" w:lastRow="0" w:noHBand="0" w:noVBand="1" w:val="04A0"/>
       </w:tblPr>
       <w:tblGrid>
-        <w:gridCol w:w="4089"/>
+        <w:gridCol w:w="4339"/>
         <w:gridCol w:w="3991"/>
-        <w:gridCol w:w="2001"/>
+        <w:gridCol w:w="1751"/>
       </w:tblGrid>
       <w:tr>
         <w:tc>
@@ -579,7 +579,7 @@
               <w:rPr>
                 <w:b/>
               </w:rPr>
-              <w:t>Mar 2024 to Jul 2025</w:t>
+              <w:t>2024-03 to 2025-07</w:t>
             </w:r>
           </w:p>
         </w:tc>
@@ -650,9 +650,9 @@
         <w:tblLook w:firstColumn="1" w:firstRow="1" w:lastColumn="0" w:lastRow="0" w:noHBand="0" w:noVBand="1" w:val="04A0"/>
       </w:tblPr>
       <w:tblGrid>
-        <w:gridCol w:w="4089"/>
+        <w:gridCol w:w="4339"/>
         <w:gridCol w:w="3991"/>
-        <w:gridCol w:w="2001"/>
+        <w:gridCol w:w="1751"/>
       </w:tblGrid>
       <w:tr>
         <w:tc>
@@ -700,7 +700,7 @@
               <w:rPr>
                 <w:b/>
               </w:rPr>
-              <w:t>Nov 2013 to Mar 2024</w:t>
+              <w:t>2013-11 to 2024-03</w:t>
             </w:r>
           </w:p>
         </w:tc>
@@ -834,9 +834,9 @@
         <w:tblLook w:firstColumn="1" w:firstRow="1" w:lastColumn="0" w:lastRow="0" w:noHBand="0" w:noVBand="1" w:val="04A0"/>
       </w:tblPr>
       <w:tblGrid>
-        <w:gridCol w:w="4089"/>
+        <w:gridCol w:w="4339"/>
         <w:gridCol w:w="3991"/>
-        <w:gridCol w:w="2001"/>
+        <w:gridCol w:w="1751"/>
       </w:tblGrid>
       <w:tr>
         <w:tc>
@@ -884,7 +884,7 @@
               <w:rPr>
                 <w:b/>
               </w:rPr>
-              <w:t>Jan 2012 to Jun 2013</w:t>
+              <w:t>2012-01 to 2013-06</w:t>
             </w:r>
           </w:p>
         </w:tc>
@@ -928,9 +928,9 @@
         <w:tblLook w:firstColumn="1" w:firstRow="1" w:lastColumn="0" w:lastRow="0" w:noHBand="0" w:noVBand="1" w:val="04A0"/>
       </w:tblPr>
       <w:tblGrid>
-        <w:gridCol w:w="4089"/>
+        <w:gridCol w:w="4339"/>
         <w:gridCol w:w="3991"/>
-        <w:gridCol w:w="2001"/>
+        <w:gridCol w:w="1751"/>
       </w:tblGrid>
       <w:tr>
         <w:tc>
@@ -978,7 +978,7 @@
               <w:rPr>
                 <w:b/>
               </w:rPr>
-              <w:t>Nov 2011 to Jan 2012</w:t>
+              <w:t>2011-11 to 2012-01</w:t>
             </w:r>
           </w:p>
         </w:tc>
@@ -1013,9 +1013,9 @@
         <w:tblLook w:firstColumn="1" w:firstRow="1" w:lastColumn="0" w:lastRow="0" w:noHBand="0" w:noVBand="1" w:val="04A0"/>
       </w:tblPr>
       <w:tblGrid>
-        <w:gridCol w:w="4089"/>
+        <w:gridCol w:w="4339"/>
         <w:gridCol w:w="3991"/>
-        <w:gridCol w:w="2001"/>
+        <w:gridCol w:w="1751"/>
       </w:tblGrid>
       <w:tr>
         <w:tc>
@@ -1063,7 +1063,7 @@
               <w:rPr>
                 <w:b/>
               </w:rPr>
-              <w:t>Apr 2011 to Oct 2011</w:t>
+              <w:t>2011-04 to 2011-10</w:t>
             </w:r>
           </w:p>
         </w:tc>
@@ -1116,9 +1116,9 @@
         <w:tblLook w:firstColumn="1" w:firstRow="1" w:lastColumn="0" w:lastRow="0" w:noHBand="0" w:noVBand="1" w:val="04A0"/>
       </w:tblPr>
       <w:tblGrid>
-        <w:gridCol w:w="4089"/>
+        <w:gridCol w:w="4339"/>
         <w:gridCol w:w="3991"/>
-        <w:gridCol w:w="2001"/>
+        <w:gridCol w:w="1751"/>
       </w:tblGrid>
       <w:tr>
         <w:tc>
@@ -1166,7 +1166,7 @@
               <w:rPr>
                 <w:b/>
               </w:rPr>
-              <w:t>Feb 2008 to Nov 2010</w:t>
+              <w:t>2008-02 to 2010-11</w:t>
             </w:r>
           </w:p>
         </w:tc>
@@ -1237,9 +1237,9 @@
         <w:tblLook w:firstColumn="1" w:firstRow="1" w:lastColumn="0" w:lastRow="0" w:noHBand="0" w:noVBand="1" w:val="04A0"/>
       </w:tblPr>
       <w:tblGrid>
-        <w:gridCol w:w="4089"/>
+        <w:gridCol w:w="4339"/>
         <w:gridCol w:w="3991"/>
-        <w:gridCol w:w="2001"/>
+        <w:gridCol w:w="1751"/>
       </w:tblGrid>
       <w:tr>
         <w:tc>
@@ -1287,7 +1287,7 @@
               <w:rPr>
                 <w:b/>
               </w:rPr>
-              <w:t>Mar 2006 to Feb 2008</w:t>
+              <w:t>2006-03 to 2008-02</w:t>
             </w:r>
           </w:p>
         </w:tc>
@@ -1331,9 +1331,9 @@
         <w:tblLook w:firstColumn="1" w:firstRow="1" w:lastColumn="0" w:lastRow="0" w:noHBand="0" w:noVBand="1" w:val="04A0"/>
       </w:tblPr>
       <w:tblGrid>
-        <w:gridCol w:w="4089"/>
+        <w:gridCol w:w="4339"/>
         <w:gridCol w:w="3991"/>
-        <w:gridCol w:w="2001"/>
+        <w:gridCol w:w="1751"/>
       </w:tblGrid>
       <w:tr>
         <w:tc>
@@ -1381,7 +1381,7 @@
               <w:rPr>
                 <w:b/>
               </w:rPr>
-              <w:t>Mar 2005 to Aug 2006</w:t>
+              <w:t>2005-03 to 2006-08</w:t>
             </w:r>
           </w:p>
         </w:tc>

</xml_diff>